<commit_message>
update reproducibility skill and v7 artifacts; align command order and payload sync
</commit_message>
<xml_diff>
--- a/outputs/open_phaseA_final_paper_v7.docx
+++ b/outputs/open_phaseA_final_paper_v7.docx
@@ -1762,13 +1762,28 @@
         <w:rPr>
           <w:rStyle w:val="VerbatimChar"/>
         </w:rPr>
+        <w:t xml:space="preserve">python src/ingest/fetch_ampad_open_subset.py</w:t>
+      </w:r>
+      <w:r>
+        <w:t xml:space="preserve"> </w:t>
+      </w:r>
+      <w:r>
+        <w:t xml:space="preserve">2)</w:t>
+      </w:r>
+      <w:r>
+        <w:t xml:space="preserve"> </w:t>
+      </w:r>
+      <w:r>
+        <w:rPr>
+          <w:rStyle w:val="VerbatimChar"/>
+        </w:rPr>
         <w:t xml:space="preserve">python src/train/run_open_phaseA_benchmark.py</w:t>
       </w:r>
       <w:r>
         <w:t xml:space="preserve"> </w:t>
       </w:r>
       <w:r>
-        <w:t xml:space="preserve">2)</w:t>
+        <w:t xml:space="preserve">3)</w:t>
       </w:r>
       <w:r>
         <w:t xml:space="preserve"> </w:t>
@@ -1783,7 +1798,7 @@
         <w:t xml:space="preserve"> </w:t>
       </w:r>
       <w:r>
-        <w:t xml:space="preserve">3)</w:t>
+        <w:t xml:space="preserve">4)</w:t>
       </w:r>
       <w:r>
         <w:t xml:space="preserve"> </w:t>
@@ -1798,7 +1813,7 @@
         <w:t xml:space="preserve"> </w:t>
       </w:r>
       <w:r>
-        <w:t xml:space="preserve">4)</w:t>
+        <w:t xml:space="preserve">5)</w:t>
       </w:r>
       <w:r>
         <w:t xml:space="preserve"> </w:t>
@@ -1808,21 +1823,6 @@
           <w:rStyle w:val="VerbatimChar"/>
         </w:rPr>
         <w:t xml:space="preserve">python src/eval/null_stability_check.py</w:t>
-      </w:r>
-      <w:r>
-        <w:t xml:space="preserve"> </w:t>
-      </w:r>
-      <w:r>
-        <w:t xml:space="preserve">5)</w:t>
-      </w:r>
-      <w:r>
-        <w:t xml:space="preserve"> </w:t>
-      </w:r>
-      <w:r>
-        <w:rPr>
-          <w:rStyle w:val="VerbatimChar"/>
-        </w:rPr>
-        <w:t xml:space="preserve">python src/ingest/fetch_ampad_open_subset.py</w:t>
       </w:r>
     </w:p>
     <w:p>

</xml_diff>

<commit_message>
address final critiques: explain raw pooled gains and expand ML literature context
</commit_message>
<xml_diff>
--- a/outputs/open_phaseA_final_paper_v7.docx
+++ b/outputs/open_phaseA_final_paper_v7.docx
@@ -82,6 +82,14 @@
       </w:r>
       <w:r>
         <w:t xml:space="preserve">3) Do AMP-AD-informed feature restrictions materially change predictive behavior?</w:t>
+      </w:r>
+    </w:p>
+    <w:p>
+      <w:pPr>
+        <w:pStyle w:val="BodyText"/>
+      </w:pPr>
+      <w:r>
+        <w:t xml:space="preserve">Recent work has reported increasingly complex machine learning approaches for AD blood transcriptomic prediction, including deep-learning/XAI feature-selection pipelines and digital-diagnosis signatures [11], [12]. Related multi-omics machine-learning frameworks also continue to improve apparent classification performance in AD-focused settings [13]. Against this landscape, our study is intentionally conservative: we prioritize leakage-safe split discipline, explicit null calibration, and transparent sensitivity labeling to reduce over-optimistic transport claims in small cross-cohort settings.</w:t>
       </w:r>
     </w:p>
     <w:bookmarkEnd w:id="10"/>
@@ -1677,6 +1685,14 @@
         <w:pStyle w:val="BodyText"/>
       </w:pPr>
       <w:r>
+        <w:t xml:space="preserve">In directional settings where source+target raw outperforms target_only, a practical explanation is that the gain from larger pooled training size can, in some cohort directions, outweigh uncorrected batch-noise penalties by better capturing shared disease-associated signal.</w:t>
+      </w:r>
+    </w:p>
+    <w:p>
+      <w:pPr>
+        <w:pStyle w:val="BodyText"/>
+      </w:pPr>
+      <w:r>
         <w:t xml:space="preserve">The relatively high target_only AUROC in GSE63061-&gt;GSE63060 (0.8908 for DE-1000) is interpreted cautiously as a property of this specific curated binary AD-vs-CTL setup and cohort composition, not as proof of universally easy blood-based AD classification.</w:t>
       </w:r>
     </w:p>
@@ -2056,6 +2072,30 @@
       </w:pPr>
       <w:r>
         <w:t xml:space="preserve">[10] L. Breiman, “Random forests,” Machine Learning, 45:5-32, 2001. doi:10.1023/A:1010933404324.</w:t>
+      </w:r>
+    </w:p>
+    <w:p>
+      <w:pPr>
+        <w:pStyle w:val="BodyText"/>
+      </w:pPr>
+      <w:r>
+        <w:t xml:space="preserve">[11] H. Lei et al., “Alzheimer’s disease prediction using deep learning and XAI based interpretable feature selection from blood gene expression data,” Scientific Reports, 2026. PMID: 41667529.</w:t>
+      </w:r>
+    </w:p>
+    <w:p>
+      <w:pPr>
+        <w:pStyle w:val="BodyText"/>
+      </w:pPr>
+      <w:r>
+        <w:t xml:space="preserve">[12] M. Altab et al., “A machine learning-enabled blood transcriptomic signature for digital diagnosis and subtyping of Alzheimer’s disease,” npj Digital Medicine, 2026. PMID: 41491414.</w:t>
+      </w:r>
+    </w:p>
+    <w:p>
+      <w:pPr>
+        <w:pStyle w:val="BodyText"/>
+      </w:pPr>
+      <w:r>
+        <w:t xml:space="preserve">[13] S. Kumar et al., “An integrative multiomics random forest framework for robust biomarker discovery,” GigaScience, 2026. PMID: 41363728.</w:t>
       </w:r>
     </w:p>
     <w:bookmarkEnd w:id="30"/>

</xml_diff>